<commit_message>
Ship managed solutions for File Drop Zone and Signature Pad
- Solution project per control (ArtFileDropZone, ArtSignaturePad;
  publisher AnkitRanaTech, prefix art), managed only.
- Tag <Control>-v<version> builds the managed solution on Windows and
  publishes a GitHub release with Art<Control>_managed.zip attached.
- README, user guides (md/docx/pdf) and setup walkthroughs point users
  to the Releases page.
</commit_message>
<xml_diff>
--- a/FileDropZone/docs/FileDropZone-User-Guide.docx
+++ b/FileDropZone/docs/FileDropZone-User-Guide.docx
@@ -70,7 +70,7 @@
           <w:noProof/>
         </w:rPr>
         <w:drawing>
-          <wp:inline distT="0" distB="0" distL="0" distR="0" wp14:anchorId="27C7E00C" wp14:editId="39EB0513">
+          <wp:inline distT="0" distB="0" distL="0" distR="0" wp14:anchorId="3E1123AF" wp14:editId="3292BF1A">
             <wp:extent cx="5715000" cy="2009775"/>
             <wp:effectExtent l="0" t="0" r="0" b="0"/>
             <wp:docPr id="1" name="control-saved.png" descr="control-saved.png" title="control-saved.png"/>
@@ -160,14 +160,13 @@
           <w:sz w:val="36"/>
           <w:szCs w:val="36"/>
         </w:rPr>
-        <w:lastRenderedPageBreak/>
         <w:t>Contents</w:t>
       </w:r>
     </w:p>
     <w:sdt>
       <w:sdtPr>
         <w:alias w:val="Contents"/>
-        <w:id w:val="-690683113"/>
+        <w:id w:val="-1778257155"/>
       </w:sdtPr>
       <w:sdtEndPr/>
       <w:sdtContent>
@@ -196,7 +195,7 @@
           <w:r>
             <w:fldChar w:fldCharType="separate"/>
           </w:r>
-          <w:hyperlink w:anchor="_Toc242111035" w:history="1">
+          <w:hyperlink w:anchor="_Toc242180888" w:history="1">
             <w:r>
               <w:rPr>
                 <w:rStyle w:val="Hyperlink"/>
@@ -220,7 +219,7 @@
               <w:rPr>
                 <w:noProof/>
               </w:rPr>
-              <w:instrText xml:space="preserve"> PAGEREF _Toc242111035 \h </w:instrText>
+              <w:instrText xml:space="preserve"> PAGEREF _Toc242180888 \h </w:instrText>
             </w:r>
             <w:r>
               <w:rPr>
@@ -263,7 +262,7 @@
               <w14:ligatures w14:val="standardContextual"/>
             </w:rPr>
           </w:pPr>
-          <w:hyperlink w:anchor="_Toc242111036" w:history="1">
+          <w:hyperlink w:anchor="_Toc242180889" w:history="1">
             <w:r>
               <w:rPr>
                 <w:rStyle w:val="Hyperlink"/>
@@ -287,7 +286,7 @@
               <w:rPr>
                 <w:noProof/>
               </w:rPr>
-              <w:instrText xml:space="preserve"> PAGEREF _Toc242111036 \h </w:instrText>
+              <w:instrText xml:space="preserve"> PAGEREF _Toc242180889 \h </w:instrText>
             </w:r>
             <w:r>
               <w:rPr>
@@ -330,7 +329,7 @@
               <w14:ligatures w14:val="standardContextual"/>
             </w:rPr>
           </w:pPr>
-          <w:hyperlink w:anchor="_Toc242111037" w:history="1">
+          <w:hyperlink w:anchor="_Toc242180890" w:history="1">
             <w:r>
               <w:rPr>
                 <w:rStyle w:val="Hyperlink"/>
@@ -354,7 +353,7 @@
               <w:rPr>
                 <w:noProof/>
               </w:rPr>
-              <w:instrText xml:space="preserve"> PAGEREF _Toc242111037 \h </w:instrText>
+              <w:instrText xml:space="preserve"> PAGEREF _Toc242180890 \h </w:instrText>
             </w:r>
             <w:r>
               <w:rPr>
@@ -397,7 +396,7 @@
               <w14:ligatures w14:val="standardContextual"/>
             </w:rPr>
           </w:pPr>
-          <w:hyperlink w:anchor="_Toc242111038" w:history="1">
+          <w:hyperlink w:anchor="_Toc242180891" w:history="1">
             <w:r>
               <w:rPr>
                 <w:rStyle w:val="Hyperlink"/>
@@ -421,7 +420,7 @@
               <w:rPr>
                 <w:noProof/>
               </w:rPr>
-              <w:instrText xml:space="preserve"> PAGEREF _Toc242111038 \h </w:instrText>
+              <w:instrText xml:space="preserve"> PAGEREF _Toc242180891 \h </w:instrText>
             </w:r>
             <w:r>
               <w:rPr>
@@ -464,7 +463,7 @@
               <w14:ligatures w14:val="standardContextual"/>
             </w:rPr>
           </w:pPr>
-          <w:hyperlink w:anchor="_Toc242111039" w:history="1">
+          <w:hyperlink w:anchor="_Toc242180892" w:history="1">
             <w:r>
               <w:rPr>
                 <w:rStyle w:val="Hyperlink"/>
@@ -488,7 +487,7 @@
               <w:rPr>
                 <w:noProof/>
               </w:rPr>
-              <w:instrText xml:space="preserve"> PAGEREF _Toc242111039 \h </w:instrText>
+              <w:instrText xml:space="preserve"> PAGEREF _Toc242180892 \h </w:instrText>
             </w:r>
             <w:r>
               <w:rPr>
@@ -531,7 +530,7 @@
               <w14:ligatures w14:val="standardContextual"/>
             </w:rPr>
           </w:pPr>
-          <w:hyperlink w:anchor="_Toc242111040" w:history="1">
+          <w:hyperlink w:anchor="_Toc242180893" w:history="1">
             <w:r>
               <w:rPr>
                 <w:rStyle w:val="Hyperlink"/>
@@ -555,7 +554,7 @@
               <w:rPr>
                 <w:noProof/>
               </w:rPr>
-              <w:instrText xml:space="preserve"> PAGEREF _Toc242111040 \h </w:instrText>
+              <w:instrText xml:space="preserve"> PAGEREF _Toc242180893 \h </w:instrText>
             </w:r>
             <w:r>
               <w:rPr>
@@ -598,7 +597,7 @@
               <w14:ligatures w14:val="standardContextual"/>
             </w:rPr>
           </w:pPr>
-          <w:hyperlink w:anchor="_Toc242111041" w:history="1">
+          <w:hyperlink w:anchor="_Toc242180894" w:history="1">
             <w:r>
               <w:rPr>
                 <w:rStyle w:val="Hyperlink"/>
@@ -622,7 +621,7 @@
               <w:rPr>
                 <w:noProof/>
               </w:rPr>
-              <w:instrText xml:space="preserve"> PAGEREF _Toc242111041 \h </w:instrText>
+              <w:instrText xml:space="preserve"> PAGEREF _Toc242180894 \h </w:instrText>
             </w:r>
             <w:r>
               <w:rPr>
@@ -665,7 +664,7 @@
               <w14:ligatures w14:val="standardContextual"/>
             </w:rPr>
           </w:pPr>
-          <w:hyperlink w:anchor="_Toc242111042" w:history="1">
+          <w:hyperlink w:anchor="_Toc242180895" w:history="1">
             <w:r>
               <w:rPr>
                 <w:rStyle w:val="Hyperlink"/>
@@ -689,7 +688,7 @@
               <w:rPr>
                 <w:noProof/>
               </w:rPr>
-              <w:instrText xml:space="preserve"> PAGEREF _Toc242111042 \h </w:instrText>
+              <w:instrText xml:space="preserve"> PAGEREF _Toc242180895 \h </w:instrText>
             </w:r>
             <w:r>
               <w:rPr>
@@ -732,7 +731,7 @@
               <w14:ligatures w14:val="standardContextual"/>
             </w:rPr>
           </w:pPr>
-          <w:hyperlink w:anchor="_Toc242111043" w:history="1">
+          <w:hyperlink w:anchor="_Toc242180896" w:history="1">
             <w:r>
               <w:rPr>
                 <w:rStyle w:val="Hyperlink"/>
@@ -756,7 +755,7 @@
               <w:rPr>
                 <w:noProof/>
               </w:rPr>
-              <w:instrText xml:space="preserve"> PAGEREF _Toc242111043 \h </w:instrText>
+              <w:instrText xml:space="preserve"> PAGEREF _Toc242180896 \h </w:instrText>
             </w:r>
             <w:r>
               <w:rPr>
@@ -799,7 +798,7 @@
               <w14:ligatures w14:val="standardContextual"/>
             </w:rPr>
           </w:pPr>
-          <w:hyperlink w:anchor="_Toc242111044" w:history="1">
+          <w:hyperlink w:anchor="_Toc242180897" w:history="1">
             <w:r>
               <w:rPr>
                 <w:rStyle w:val="Hyperlink"/>
@@ -823,7 +822,7 @@
               <w:rPr>
                 <w:noProof/>
               </w:rPr>
-              <w:instrText xml:space="preserve"> PAGEREF _Toc242111044 \h </w:instrText>
+              <w:instrText xml:space="preserve"> PAGEREF _Toc242180897 \h </w:instrText>
             </w:r>
             <w:r>
               <w:rPr>
@@ -866,7 +865,7 @@
               <w14:ligatures w14:val="standardContextual"/>
             </w:rPr>
           </w:pPr>
-          <w:hyperlink w:anchor="_Toc242111045" w:history="1">
+          <w:hyperlink w:anchor="_Toc242180898" w:history="1">
             <w:r>
               <w:rPr>
                 <w:rStyle w:val="Hyperlink"/>
@@ -890,7 +889,7 @@
               <w:rPr>
                 <w:noProof/>
               </w:rPr>
-              <w:instrText xml:space="preserve"> PAGEREF _Toc242111045 \h </w:instrText>
+              <w:instrText xml:space="preserve"> PAGEREF _Toc242180898 \h </w:instrText>
             </w:r>
             <w:r>
               <w:rPr>
@@ -933,7 +932,7 @@
               <w14:ligatures w14:val="standardContextual"/>
             </w:rPr>
           </w:pPr>
-          <w:hyperlink w:anchor="_Toc242111046" w:history="1">
+          <w:hyperlink w:anchor="_Toc242180899" w:history="1">
             <w:r>
               <w:rPr>
                 <w:rStyle w:val="Hyperlink"/>
@@ -957,7 +956,7 @@
               <w:rPr>
                 <w:noProof/>
               </w:rPr>
-              <w:instrText xml:space="preserve"> PAGEREF _Toc242111046 \h </w:instrText>
+              <w:instrText xml:space="preserve"> PAGEREF _Toc242180899 \h </w:instrText>
             </w:r>
             <w:r>
               <w:rPr>
@@ -996,9 +995,8 @@
         <w:pStyle w:val="Heading1"/>
         <w:pageBreakBefore/>
       </w:pPr>
-      <w:bookmarkStart w:id="0" w:name="_Toc242111035"/>
-      <w:r>
-        <w:lastRenderedPageBreak/>
+      <w:bookmarkStart w:id="0" w:name="_Toc242180888"/>
+      <w:r>
         <w:t>1. Overview</w:t>
       </w:r>
       <w:bookmarkEnd w:id="0"/>
@@ -1061,7 +1059,7 @@
           <w:noProof/>
         </w:rPr>
         <w:drawing>
-          <wp:inline distT="0" distB="0" distL="0" distR="0" wp14:anchorId="082E8625" wp14:editId="7BDCDD8E">
+          <wp:inline distT="0" distB="0" distL="0" distR="0" wp14:anchorId="42BA09B5" wp14:editId="7613469B">
             <wp:extent cx="5334000" cy="3028950"/>
             <wp:effectExtent l="0" t="0" r="0" b="0"/>
             <wp:docPr id="2" name="control-uploading.png" descr="Upload queue: a blocked file, a duplicate prompt, a large file at 57% and a finished upload" title="Upload queue: a blocked file, a duplicate prompt, a large file at 57% and a finished upload"/>
@@ -1120,7 +1118,7 @@
       <w:pPr>
         <w:pStyle w:val="Heading2"/>
       </w:pPr>
-      <w:bookmarkStart w:id="1" w:name="_Toc242111036"/>
+      <w:bookmarkStart w:id="1" w:name="_Toc242180889"/>
       <w:r>
         <w:t>Features</w:t>
       </w:r>
@@ -1141,7 +1139,7 @@
           <w:left w:w="10" w:type="dxa"/>
           <w:right w:w="10" w:type="dxa"/>
         </w:tblCellMar>
-        <w:tblLook w:val="0000" w:firstRow="0" w:lastRow="0" w:firstColumn="0" w:lastColumn="0" w:noHBand="0" w:noVBand="0"/>
+        <w:tblLook w:val="04A0" w:firstRow="1" w:lastRow="0" w:firstColumn="1" w:lastColumn="0" w:noHBand="0" w:noVBand="1"/>
       </w:tblPr>
       <w:tblGrid>
         <w:gridCol w:w="2400"/>
@@ -1634,7 +1632,6 @@
           </w:tcPr>
           <w:p>
             <w:r>
-              <w:lastRenderedPageBreak/>
               <w:t>Parallel uploads</w:t>
             </w:r>
           </w:p>
@@ -1921,7 +1918,7 @@
       <w:pPr>
         <w:pStyle w:val="Heading1"/>
       </w:pPr>
-      <w:bookmarkStart w:id="2" w:name="_Toc242111037"/>
+      <w:bookmarkStart w:id="2" w:name="_Toc242180890"/>
       <w:r>
         <w:t>2. Requirements</w:t>
       </w:r>
@@ -2023,7 +2020,7 @@
       <w:pPr>
         <w:pStyle w:val="Heading1"/>
       </w:pPr>
-      <w:bookmarkStart w:id="3" w:name="_Toc242111038"/>
+      <w:bookmarkStart w:id="3" w:name="_Toc242180891"/>
       <w:r>
         <w:t>3. Install the solution</w:t>
       </w:r>
@@ -2039,17 +2036,7 @@
         <w:spacing w:after="80"/>
       </w:pPr>
       <w:r>
-        <w:t xml:space="preserve">Download the latest </w:t>
-      </w:r>
-      <w:r>
-        <w:rPr>
-          <w:b/>
-          <w:bCs/>
-        </w:rPr>
-        <w:t>managed</w:t>
-      </w:r>
-      <w:r>
-        <w:t xml:space="preserve"> solution, for example </w:t>
+        <w:t xml:space="preserve">Download </w:t>
       </w:r>
       <w:r>
         <w:rPr>
@@ -2061,7 +2048,27 @@
         <w:t>ArtFileDropZone_managed.zip</w:t>
       </w:r>
       <w:r>
-        <w:t>.</w:t>
+        <w:t xml:space="preserve"> from the latest </w:t>
+      </w:r>
+      <w:r>
+        <w:rPr>
+          <w:b/>
+          <w:bCs/>
+        </w:rPr>
+        <w:t>File Drop Zone</w:t>
+      </w:r>
+      <w:r>
+        <w:t xml:space="preserve"> release on github.com/ankitrana/PCF-Controls/releases (under </w:t>
+      </w:r>
+      <w:r>
+        <w:rPr>
+          <w:i/>
+          <w:iCs/>
+        </w:rPr>
+        <w:t>Assets</w:t>
+      </w:r>
+      <w:r>
+        <w:t>).</w:t>
       </w:r>
     </w:p>
     <w:p>
@@ -2179,9 +2186,8 @@
         <w:pStyle w:val="Heading1"/>
         <w:pageBreakBefore/>
       </w:pPr>
-      <w:bookmarkStart w:id="4" w:name="_Toc242111039"/>
-      <w:r>
-        <w:lastRenderedPageBreak/>
+      <w:bookmarkStart w:id="4" w:name="_Toc242180892"/>
+      <w:r>
         <w:t>4. Add the control to a form</w:t>
       </w:r>
       <w:bookmarkEnd w:id="4"/>
@@ -2459,7 +2465,7 @@
       <w:pPr>
         <w:pStyle w:val="Heading1"/>
       </w:pPr>
-      <w:bookmarkStart w:id="5" w:name="_Toc242111040"/>
+      <w:bookmarkStart w:id="5" w:name="_Toc242180893"/>
       <w:r>
         <w:t>5. Settings reference</w:t>
       </w:r>
@@ -2480,7 +2486,7 @@
           <w:left w:w="10" w:type="dxa"/>
           <w:right w:w="10" w:type="dxa"/>
         </w:tblCellMar>
-        <w:tblLook w:val="0000" w:firstRow="0" w:lastRow="0" w:firstColumn="0" w:lastColumn="0" w:noHBand="0" w:noVBand="0"/>
+        <w:tblLook w:val="04A0" w:firstRow="1" w:lastRow="0" w:firstColumn="1" w:lastColumn="0" w:noHBand="0" w:noVBand="1"/>
       </w:tblPr>
       <w:tblGrid>
         <w:gridCol w:w="2500"/>
@@ -3254,9 +3260,8 @@
       <w:pPr>
         <w:pStyle w:val="Heading2"/>
       </w:pPr>
-      <w:bookmarkStart w:id="6" w:name="_Toc242111041"/>
-      <w:r>
-        <w:lastRenderedPageBreak/>
+      <w:bookmarkStart w:id="6" w:name="_Toc242180894"/>
+      <w:r>
         <w:t>Example setups</w:t>
       </w:r>
       <w:bookmarkEnd w:id="6"/>
@@ -3276,7 +3281,7 @@
           <w:left w:w="10" w:type="dxa"/>
           <w:right w:w="10" w:type="dxa"/>
         </w:tblCellMar>
-        <w:tblLook w:val="0000" w:firstRow="0" w:lastRow="0" w:firstColumn="0" w:lastColumn="0" w:noHBand="0" w:noVBand="0"/>
+        <w:tblLook w:val="04A0" w:firstRow="1" w:lastRow="0" w:firstColumn="1" w:lastColumn="0" w:noHBand="0" w:noVBand="1"/>
       </w:tblPr>
       <w:tblGrid>
         <w:gridCol w:w="3200"/>
@@ -3524,7 +3529,7 @@
       <w:pPr>
         <w:pStyle w:val="Heading1"/>
       </w:pPr>
-      <w:bookmarkStart w:id="7" w:name="_Toc242111042"/>
+      <w:bookmarkStart w:id="7" w:name="_Toc242180895"/>
       <w:r>
         <w:t>6. Using the control</w:t>
       </w:r>
@@ -3545,7 +3550,7 @@
           <w:left w:w="10" w:type="dxa"/>
           <w:right w:w="10" w:type="dxa"/>
         </w:tblCellMar>
-        <w:tblLook w:val="0000" w:firstRow="0" w:lastRow="0" w:firstColumn="0" w:lastColumn="0" w:noHBand="0" w:noVBand="0"/>
+        <w:tblLook w:val="04A0" w:firstRow="1" w:lastRow="0" w:firstColumn="1" w:lastColumn="0" w:noHBand="0" w:noVBand="1"/>
       </w:tblPr>
       <w:tblGrid>
         <w:gridCol w:w="2600"/>
@@ -4050,7 +4055,7 @@
           <w:noProof/>
         </w:rPr>
         <w:drawing>
-          <wp:inline distT="0" distB="0" distL="0" distR="0" wp14:anchorId="632C7F8E" wp14:editId="3D2644E0">
+          <wp:inline distT="0" distB="0" distL="0" distR="0" wp14:anchorId="5C88B10D" wp14:editId="02FD2C99">
             <wp:extent cx="3619500" cy="2857500"/>
             <wp:effectExtent l="0" t="0" r="0" b="0"/>
             <wp:docPr id="3" name="control-preview.png" descr="Preview dialog for an image attachment" title="Preview dialog for an image attachment"/>
@@ -4110,9 +4115,8 @@
         <w:pStyle w:val="Heading1"/>
         <w:pageBreakBefore/>
       </w:pPr>
-      <w:bookmarkStart w:id="8" w:name="_Toc242111043"/>
-      <w:r>
-        <w:lastRenderedPageBreak/>
+      <w:bookmarkStart w:id="8" w:name="_Toc242180896"/>
+      <w:r>
         <w:t>7. File rules and limits</w:t>
       </w:r>
       <w:bookmarkEnd w:id="8"/>
@@ -4140,7 +4144,7 @@
           <w:left w:w="10" w:type="dxa"/>
           <w:right w:w="10" w:type="dxa"/>
         </w:tblCellMar>
-        <w:tblLook w:val="0000" w:firstRow="0" w:lastRow="0" w:firstColumn="0" w:lastColumn="0" w:noHBand="0" w:noVBand="0"/>
+        <w:tblLook w:val="04A0" w:firstRow="1" w:lastRow="0" w:firstColumn="1" w:lastColumn="0" w:noHBand="0" w:noVBand="1"/>
       </w:tblPr>
       <w:tblGrid>
         <w:gridCol w:w="2600"/>
@@ -4559,7 +4563,7 @@
       <w:pPr>
         <w:pStyle w:val="Heading1"/>
       </w:pPr>
-      <w:bookmarkStart w:id="9" w:name="_Toc242111044"/>
+      <w:bookmarkStart w:id="9" w:name="_Toc242180897"/>
       <w:r>
         <w:t>8. Security</w:t>
       </w:r>
@@ -4588,7 +4592,7 @@
           <w:left w:w="10" w:type="dxa"/>
           <w:right w:w="10" w:type="dxa"/>
         </w:tblCellMar>
-        <w:tblLook w:val="0000" w:firstRow="0" w:lastRow="0" w:firstColumn="0" w:lastColumn="0" w:noHBand="0" w:noVBand="0"/>
+        <w:tblLook w:val="04A0" w:firstRow="1" w:lastRow="0" w:firstColumn="1" w:lastColumn="0" w:noHBand="0" w:noVBand="1"/>
       </w:tblPr>
       <w:tblGrid>
         <w:gridCol w:w="2600"/>
@@ -4891,9 +4895,8 @@
         <w:pStyle w:val="Heading1"/>
         <w:pageBreakBefore/>
       </w:pPr>
-      <w:bookmarkStart w:id="10" w:name="_Toc242111045"/>
-      <w:r>
-        <w:lastRenderedPageBreak/>
+      <w:bookmarkStart w:id="10" w:name="_Toc242180898"/>
+      <w:r>
         <w:t>9. Troubleshooting</w:t>
       </w:r>
       <w:bookmarkEnd w:id="10"/>
@@ -4913,7 +4916,7 @@
           <w:left w:w="10" w:type="dxa"/>
           <w:right w:w="10" w:type="dxa"/>
         </w:tblCellMar>
-        <w:tblLook w:val="0000" w:firstRow="0" w:lastRow="0" w:firstColumn="0" w:lastColumn="0" w:noHBand="0" w:noVBand="0"/>
+        <w:tblLook w:val="04A0" w:firstRow="1" w:lastRow="0" w:firstColumn="1" w:lastColumn="0" w:noHBand="0" w:noVBand="1"/>
       </w:tblPr>
       <w:tblGrid>
         <w:gridCol w:w="3600"/>
@@ -5491,7 +5494,7 @@
       <w:pPr>
         <w:pStyle w:val="Heading1"/>
       </w:pPr>
-      <w:bookmarkStart w:id="11" w:name="_Toc242111046"/>
+      <w:bookmarkStart w:id="11" w:name="_Toc242180899"/>
       <w:r>
         <w:t>10. Update or uninstall</w:t>
       </w:r>
@@ -5779,10 +5782,172 @@
 <file path=word/numbering.xml><?xml version="1.0" encoding="utf-8"?>
 <w:numbering xmlns:wpc="http://schemas.microsoft.com/office/word/2010/wordprocessingCanvas" xmlns:cx="http://schemas.microsoft.com/office/drawing/2014/chartex" xmlns:cx1="http://schemas.microsoft.com/office/drawing/2015/9/8/chartex" xmlns:cx2="http://schemas.microsoft.com/office/drawing/2015/10/21/chartex" xmlns:cx3="http://schemas.microsoft.com/office/drawing/2016/5/9/chartex" xmlns:cx4="http://schemas.microsoft.com/office/drawing/2016/5/10/chartex" xmlns:cx5="http://schemas.microsoft.com/office/drawing/2016/5/11/chartex" xmlns:cx6="http://schemas.microsoft.com/office/drawing/2016/5/12/chartex" xmlns:cx7="http://schemas.microsoft.com/office/drawing/2016/5/13/chartex" xmlns:cx8="http://schemas.microsoft.com/office/drawing/2016/5/14/chartex" xmlns:mc="http://schemas.openxmlformats.org/markup-compatibility/2006" xmlns:aink="http://schemas.microsoft.com/office/drawing/2016/ink" xmlns:am3d="http://schemas.microsoft.com/office/drawing/2017/model3d" xmlns:o="urn:schemas-microsoft-com:office:office" xmlns:oel="http://schemas.microsoft.com/office/2019/extlst" xmlns:r="http://schemas.openxmlformats.org/officeDocument/2006/relationships" xmlns:m="http://schemas.openxmlformats.org/officeDocument/2006/math" xmlns:v="urn:schemas-microsoft-com:vml" xmlns:wp14="http://schemas.microsoft.com/office/word/2010/wordprocessingDrawing" xmlns:wp="http://schemas.openxmlformats.org/drawingml/2006/wordprocessingDrawing" xmlns:w10="urn:schemas-microsoft-com:office:word" xmlns:w="http://schemas.openxmlformats.org/wordprocessingml/2006/main" xmlns:w14="http://schemas.microsoft.com/office/word/2010/wordml" xmlns:w15="http://schemas.microsoft.com/office/word/2012/wordml" xmlns:w16cex="http://schemas.microsoft.com/office/word/2018/wordml/cex" xmlns:w16cid="http://schemas.microsoft.com/office/word/2016/wordml/cid" xmlns:w16="http://schemas.microsoft.com/office/word/2018/wordml" xmlns:w16du="http://schemas.microsoft.com/office/word/2023/wordml/word16du" xmlns:w16sdtdh="http://schemas.microsoft.com/office/word/2020/wordml/sdtdatahash" xmlns:w16sdtfl="http://schemas.microsoft.com/office/word/2024/wordml/sdtformatlock" xmlns:w16se="http://schemas.microsoft.com/office/word/2015/wordml/symex" xmlns:wpg="http://schemas.microsoft.com/office/word/2010/wordprocessingGroup" xmlns:wpi="http://schemas.microsoft.com/office/word/2010/wordprocessingInk" xmlns:wne="http://schemas.microsoft.com/office/word/2006/wordml" xmlns:wps="http://schemas.microsoft.com/office/word/2010/wordprocessingShape" mc:Ignorable="w14 w15 w16se w16cid w16 w16cex w16sdtdh w16sdtfl w16du wp14">
   <w:abstractNum w:abstractNumId="0" w15:restartNumberingAfterBreak="0">
-    <w:nsid w:val="02A94464"/>
+    <w:nsid w:val="465B5897"/>
     <w:multiLevelType w:val="hybridMultilevel"/>
-    <w:tmpl w:val="836EA040"/>
-    <w:lvl w:ilvl="0" w:tplc="54D85FAE" w:tentative="1">
+    <w:tmpl w:val="AA282D3C"/>
+    <w:lvl w:ilvl="0" w:tplc="A84E4F7C">
+      <w:start w:val="1"/>
+      <w:numFmt w:val="decimal"/>
+      <w:lvlText w:val="%1."/>
+      <w:lvlJc w:val="left"/>
+      <w:pPr>
+        <w:ind w:left="400" w:hanging="300"/>
+      </w:pPr>
+    </w:lvl>
+    <w:lvl w:ilvl="1" w:tplc="A5820EC6">
+      <w:numFmt w:val="decimal"/>
+      <w:lvlText w:val=""/>
+      <w:lvlJc w:val="left"/>
+    </w:lvl>
+    <w:lvl w:ilvl="2" w:tplc="09FA1200">
+      <w:numFmt w:val="decimal"/>
+      <w:lvlText w:val=""/>
+      <w:lvlJc w:val="left"/>
+    </w:lvl>
+    <w:lvl w:ilvl="3" w:tplc="F258A04C">
+      <w:numFmt w:val="decimal"/>
+      <w:lvlText w:val=""/>
+      <w:lvlJc w:val="left"/>
+    </w:lvl>
+    <w:lvl w:ilvl="4" w:tplc="0AD0407C">
+      <w:numFmt w:val="decimal"/>
+      <w:lvlText w:val=""/>
+      <w:lvlJc w:val="left"/>
+    </w:lvl>
+    <w:lvl w:ilvl="5" w:tplc="2CB2FA5A">
+      <w:numFmt w:val="decimal"/>
+      <w:lvlText w:val=""/>
+      <w:lvlJc w:val="left"/>
+    </w:lvl>
+    <w:lvl w:ilvl="6" w:tplc="D6C0259E">
+      <w:numFmt w:val="decimal"/>
+      <w:lvlText w:val=""/>
+      <w:lvlJc w:val="left"/>
+    </w:lvl>
+    <w:lvl w:ilvl="7" w:tplc="8DE2825A">
+      <w:numFmt w:val="decimal"/>
+      <w:lvlText w:val=""/>
+      <w:lvlJc w:val="left"/>
+    </w:lvl>
+    <w:lvl w:ilvl="8" w:tplc="4B485F30">
+      <w:numFmt w:val="decimal"/>
+      <w:lvlText w:val=""/>
+      <w:lvlJc w:val="left"/>
+    </w:lvl>
+  </w:abstractNum>
+  <w:abstractNum w:abstractNumId="1" w15:restartNumberingAfterBreak="0">
+    <w:nsid w:val="59666D57"/>
+    <w:multiLevelType w:val="hybridMultilevel"/>
+    <w:tmpl w:val="F33843BA"/>
+    <w:lvl w:ilvl="0" w:tplc="85B03600">
+      <w:start w:val="1"/>
+      <w:numFmt w:val="bullet"/>
+      <w:lvlText w:val="•"/>
+      <w:lvlJc w:val="left"/>
+      <w:pPr>
+        <w:ind w:left="400" w:hanging="260"/>
+      </w:pPr>
+    </w:lvl>
+    <w:lvl w:ilvl="1" w:tplc="09C41F0A">
+      <w:numFmt w:val="decimal"/>
+      <w:lvlText w:val=""/>
+      <w:lvlJc w:val="left"/>
+    </w:lvl>
+    <w:lvl w:ilvl="2" w:tplc="1BA01D9E">
+      <w:numFmt w:val="decimal"/>
+      <w:lvlText w:val=""/>
+      <w:lvlJc w:val="left"/>
+    </w:lvl>
+    <w:lvl w:ilvl="3" w:tplc="9D24F290">
+      <w:numFmt w:val="decimal"/>
+      <w:lvlText w:val=""/>
+      <w:lvlJc w:val="left"/>
+    </w:lvl>
+    <w:lvl w:ilvl="4" w:tplc="2B8854FA">
+      <w:numFmt w:val="decimal"/>
+      <w:lvlText w:val=""/>
+      <w:lvlJc w:val="left"/>
+    </w:lvl>
+    <w:lvl w:ilvl="5" w:tplc="8B38757C">
+      <w:numFmt w:val="decimal"/>
+      <w:lvlText w:val=""/>
+      <w:lvlJc w:val="left"/>
+    </w:lvl>
+    <w:lvl w:ilvl="6" w:tplc="A190B9C2">
+      <w:numFmt w:val="decimal"/>
+      <w:lvlText w:val=""/>
+      <w:lvlJc w:val="left"/>
+    </w:lvl>
+    <w:lvl w:ilvl="7" w:tplc="D2A23C7A">
+      <w:numFmt w:val="decimal"/>
+      <w:lvlText w:val=""/>
+      <w:lvlJc w:val="left"/>
+    </w:lvl>
+    <w:lvl w:ilvl="8" w:tplc="A52E3F7E">
+      <w:numFmt w:val="decimal"/>
+      <w:lvlText w:val=""/>
+      <w:lvlJc w:val="left"/>
+    </w:lvl>
+  </w:abstractNum>
+  <w:abstractNum w:abstractNumId="2" w15:restartNumberingAfterBreak="0">
+    <w:nsid w:val="59B95777"/>
+    <w:multiLevelType w:val="hybridMultilevel"/>
+    <w:tmpl w:val="79482C60"/>
+    <w:lvl w:ilvl="0" w:tplc="DD8E1032">
+      <w:start w:val="1"/>
+      <w:numFmt w:val="decimal"/>
+      <w:lvlText w:val="%1."/>
+      <w:lvlJc w:val="left"/>
+      <w:pPr>
+        <w:ind w:left="400" w:hanging="300"/>
+      </w:pPr>
+    </w:lvl>
+    <w:lvl w:ilvl="1" w:tplc="A7C26A7C">
+      <w:numFmt w:val="decimal"/>
+      <w:lvlText w:val=""/>
+      <w:lvlJc w:val="left"/>
+    </w:lvl>
+    <w:lvl w:ilvl="2" w:tplc="AC5E10E8">
+      <w:numFmt w:val="decimal"/>
+      <w:lvlText w:val=""/>
+      <w:lvlJc w:val="left"/>
+    </w:lvl>
+    <w:lvl w:ilvl="3" w:tplc="079070A8">
+      <w:numFmt w:val="decimal"/>
+      <w:lvlText w:val=""/>
+      <w:lvlJc w:val="left"/>
+    </w:lvl>
+    <w:lvl w:ilvl="4" w:tplc="4B30C79C">
+      <w:numFmt w:val="decimal"/>
+      <w:lvlText w:val=""/>
+      <w:lvlJc w:val="left"/>
+    </w:lvl>
+    <w:lvl w:ilvl="5" w:tplc="5CB4EEAA">
+      <w:numFmt w:val="decimal"/>
+      <w:lvlText w:val=""/>
+      <w:lvlJc w:val="left"/>
+    </w:lvl>
+    <w:lvl w:ilvl="6" w:tplc="A8B22BDA">
+      <w:numFmt w:val="decimal"/>
+      <w:lvlText w:val=""/>
+      <w:lvlJc w:val="left"/>
+    </w:lvl>
+    <w:lvl w:ilvl="7" w:tplc="D8EEAD18">
+      <w:numFmt w:val="decimal"/>
+      <w:lvlText w:val=""/>
+      <w:lvlJc w:val="left"/>
+    </w:lvl>
+    <w:lvl w:ilvl="8" w:tplc="27E28912">
+      <w:numFmt w:val="decimal"/>
+      <w:lvlText w:val=""/>
+      <w:lvlJc w:val="left"/>
+    </w:lvl>
+  </w:abstractNum>
+  <w:abstractNum w:abstractNumId="3" w15:restartNumberingAfterBreak="0">
+    <w:nsid w:val="61C3450C"/>
+    <w:multiLevelType w:val="hybridMultilevel"/>
+    <w:tmpl w:val="9F9E206A"/>
+    <w:lvl w:ilvl="0" w:tplc="CDDAA552" w:tentative="1">
       <w:start w:val="1"/>
       <w:numFmt w:val="bullet"/>
       <w:lvlText w:val="●"/>
@@ -5791,7 +5956,7 @@
         <w:ind w:left="720" w:hanging="360"/>
       </w:pPr>
     </w:lvl>
-    <w:lvl w:ilvl="1" w:tplc="22DEE0BE" w:tentative="1">
+    <w:lvl w:ilvl="1" w:tplc="E93E6C64" w:tentative="1">
       <w:start w:val="1"/>
       <w:numFmt w:val="bullet"/>
       <w:lvlText w:val="○"/>
@@ -5800,7 +5965,7 @@
         <w:ind w:left="1440" w:hanging="360"/>
       </w:pPr>
     </w:lvl>
-    <w:lvl w:ilvl="2" w:tplc="68920180" w:tentative="1">
+    <w:lvl w:ilvl="2" w:tplc="90081C18" w:tentative="1">
       <w:start w:val="1"/>
       <w:numFmt w:val="bullet"/>
       <w:lvlText w:val="■"/>
@@ -5809,7 +5974,7 @@
         <w:ind w:left="2160" w:hanging="360"/>
       </w:pPr>
     </w:lvl>
-    <w:lvl w:ilvl="3" w:tplc="FE8CDBCA" w:tentative="1">
+    <w:lvl w:ilvl="3" w:tplc="3E2C9AFA" w:tentative="1">
       <w:start w:val="1"/>
       <w:numFmt w:val="bullet"/>
       <w:lvlText w:val="●"/>
@@ -5818,7 +5983,7 @@
         <w:ind w:left="2880" w:hanging="360"/>
       </w:pPr>
     </w:lvl>
-    <w:lvl w:ilvl="4" w:tplc="7C08CDDE" w:tentative="1">
+    <w:lvl w:ilvl="4" w:tplc="E8C0C214" w:tentative="1">
       <w:start w:val="1"/>
       <w:numFmt w:val="bullet"/>
       <w:lvlText w:val="○"/>
@@ -5827,7 +5992,7 @@
         <w:ind w:left="3600" w:hanging="360"/>
       </w:pPr>
     </w:lvl>
-    <w:lvl w:ilvl="5" w:tplc="40545326" w:tentative="1">
+    <w:lvl w:ilvl="5" w:tplc="2B748714" w:tentative="1">
       <w:start w:val="1"/>
       <w:numFmt w:val="bullet"/>
       <w:lvlText w:val="■"/>
@@ -5836,7 +6001,7 @@
         <w:ind w:left="4320" w:hanging="360"/>
       </w:pPr>
     </w:lvl>
-    <w:lvl w:ilvl="6" w:tplc="5768AF76" w:tentative="1">
+    <w:lvl w:ilvl="6" w:tplc="804A0E7A" w:tentative="1">
       <w:start w:val="1"/>
       <w:numFmt w:val="bullet"/>
       <w:lvlText w:val="●"/>
@@ -5845,7 +6010,7 @@
         <w:ind w:left="5040" w:hanging="360"/>
       </w:pPr>
     </w:lvl>
-    <w:lvl w:ilvl="7" w:tplc="F42257F6" w:tentative="1">
+    <w:lvl w:ilvl="7" w:tplc="D178991C" w:tentative="1">
       <w:start w:val="1"/>
       <w:numFmt w:val="bullet"/>
       <w:lvlText w:val="●"/>
@@ -5854,7 +6019,7 @@
         <w:ind w:left="5760" w:hanging="360"/>
       </w:pPr>
     </w:lvl>
-    <w:lvl w:ilvl="8" w:tplc="E4FE7C86" w:tentative="1">
+    <w:lvl w:ilvl="8" w:tplc="6B1A2C26" w:tentative="1">
       <w:start w:val="1"/>
       <w:numFmt w:val="bullet"/>
       <w:lvlText w:val="●"/>
@@ -5864,188 +6029,26 @@
       </w:pPr>
     </w:lvl>
   </w:abstractNum>
-  <w:abstractNum w:abstractNumId="1" w15:restartNumberingAfterBreak="0">
-    <w:nsid w:val="10500BF2"/>
-    <w:multiLevelType w:val="hybridMultilevel"/>
-    <w:tmpl w:val="D1C4CA88"/>
-    <w:lvl w:ilvl="0" w:tplc="5FA0E252">
-      <w:start w:val="1"/>
-      <w:numFmt w:val="bullet"/>
-      <w:lvlText w:val="•"/>
-      <w:lvlJc w:val="left"/>
-      <w:pPr>
-        <w:ind w:left="400" w:hanging="260"/>
-      </w:pPr>
-    </w:lvl>
-    <w:lvl w:ilvl="1" w:tplc="FF0AEB74">
-      <w:numFmt w:val="decimal"/>
-      <w:lvlText w:val=""/>
-      <w:lvlJc w:val="left"/>
-    </w:lvl>
-    <w:lvl w:ilvl="2" w:tplc="8542A2CC">
-      <w:numFmt w:val="decimal"/>
-      <w:lvlText w:val=""/>
-      <w:lvlJc w:val="left"/>
-    </w:lvl>
-    <w:lvl w:ilvl="3" w:tplc="FF8E7DD8">
-      <w:numFmt w:val="decimal"/>
-      <w:lvlText w:val=""/>
-      <w:lvlJc w:val="left"/>
-    </w:lvl>
-    <w:lvl w:ilvl="4" w:tplc="6CD217D6">
-      <w:numFmt w:val="decimal"/>
-      <w:lvlText w:val=""/>
-      <w:lvlJc w:val="left"/>
-    </w:lvl>
-    <w:lvl w:ilvl="5" w:tplc="AFAABC6C">
-      <w:numFmt w:val="decimal"/>
-      <w:lvlText w:val=""/>
-      <w:lvlJc w:val="left"/>
-    </w:lvl>
-    <w:lvl w:ilvl="6" w:tplc="FF922C80">
-      <w:numFmt w:val="decimal"/>
-      <w:lvlText w:val=""/>
-      <w:lvlJc w:val="left"/>
-    </w:lvl>
-    <w:lvl w:ilvl="7" w:tplc="BA98F66A">
-      <w:numFmt w:val="decimal"/>
-      <w:lvlText w:val=""/>
-      <w:lvlJc w:val="left"/>
-    </w:lvl>
-    <w:lvl w:ilvl="8" w:tplc="EDCAF9F2">
-      <w:numFmt w:val="decimal"/>
-      <w:lvlText w:val=""/>
-      <w:lvlJc w:val="left"/>
-    </w:lvl>
-  </w:abstractNum>
-  <w:abstractNum w:abstractNumId="2" w15:restartNumberingAfterBreak="0">
-    <w:nsid w:val="1E7113AF"/>
-    <w:multiLevelType w:val="hybridMultilevel"/>
-    <w:tmpl w:val="A0E06114"/>
-    <w:lvl w:ilvl="0" w:tplc="90FE0DCE">
-      <w:start w:val="1"/>
-      <w:numFmt w:val="decimal"/>
-      <w:lvlText w:val="%1."/>
-      <w:lvlJc w:val="left"/>
-      <w:pPr>
-        <w:ind w:left="400" w:hanging="300"/>
-      </w:pPr>
-    </w:lvl>
-    <w:lvl w:ilvl="1" w:tplc="EC96C380">
-      <w:numFmt w:val="decimal"/>
-      <w:lvlText w:val=""/>
-      <w:lvlJc w:val="left"/>
-    </w:lvl>
-    <w:lvl w:ilvl="2" w:tplc="BE42691C">
-      <w:numFmt w:val="decimal"/>
-      <w:lvlText w:val=""/>
-      <w:lvlJc w:val="left"/>
-    </w:lvl>
-    <w:lvl w:ilvl="3" w:tplc="E75A05EC">
-      <w:numFmt w:val="decimal"/>
-      <w:lvlText w:val=""/>
-      <w:lvlJc w:val="left"/>
-    </w:lvl>
-    <w:lvl w:ilvl="4" w:tplc="6840C312">
-      <w:numFmt w:val="decimal"/>
-      <w:lvlText w:val=""/>
-      <w:lvlJc w:val="left"/>
-    </w:lvl>
-    <w:lvl w:ilvl="5" w:tplc="253E1954">
-      <w:numFmt w:val="decimal"/>
-      <w:lvlText w:val=""/>
-      <w:lvlJc w:val="left"/>
-    </w:lvl>
-    <w:lvl w:ilvl="6" w:tplc="09F0A7CE">
-      <w:numFmt w:val="decimal"/>
-      <w:lvlText w:val=""/>
-      <w:lvlJc w:val="left"/>
-    </w:lvl>
-    <w:lvl w:ilvl="7" w:tplc="F37EDC4E">
-      <w:numFmt w:val="decimal"/>
-      <w:lvlText w:val=""/>
-      <w:lvlJc w:val="left"/>
-    </w:lvl>
-    <w:lvl w:ilvl="8" w:tplc="5E4CEEAA">
-      <w:numFmt w:val="decimal"/>
-      <w:lvlText w:val=""/>
-      <w:lvlJc w:val="left"/>
-    </w:lvl>
-  </w:abstractNum>
-  <w:abstractNum w:abstractNumId="3" w15:restartNumberingAfterBreak="0">
-    <w:nsid w:val="33AB5538"/>
-    <w:multiLevelType w:val="hybridMultilevel"/>
-    <w:tmpl w:val="FA4CE7AC"/>
-    <w:lvl w:ilvl="0" w:tplc="65FE1634">
-      <w:start w:val="1"/>
-      <w:numFmt w:val="decimal"/>
-      <w:lvlText w:val="%1."/>
-      <w:lvlJc w:val="left"/>
-      <w:pPr>
-        <w:ind w:left="400" w:hanging="300"/>
-      </w:pPr>
-    </w:lvl>
-    <w:lvl w:ilvl="1" w:tplc="3D8C7ACC">
-      <w:numFmt w:val="decimal"/>
-      <w:lvlText w:val=""/>
-      <w:lvlJc w:val="left"/>
-    </w:lvl>
-    <w:lvl w:ilvl="2" w:tplc="89CCFFD8">
-      <w:numFmt w:val="decimal"/>
-      <w:lvlText w:val=""/>
-      <w:lvlJc w:val="left"/>
-    </w:lvl>
-    <w:lvl w:ilvl="3" w:tplc="85AA404A">
-      <w:numFmt w:val="decimal"/>
-      <w:lvlText w:val=""/>
-      <w:lvlJc w:val="left"/>
-    </w:lvl>
-    <w:lvl w:ilvl="4" w:tplc="A11C22F6">
-      <w:numFmt w:val="decimal"/>
-      <w:lvlText w:val=""/>
-      <w:lvlJc w:val="left"/>
-    </w:lvl>
-    <w:lvl w:ilvl="5" w:tplc="A21C797A">
-      <w:numFmt w:val="decimal"/>
-      <w:lvlText w:val=""/>
-      <w:lvlJc w:val="left"/>
-    </w:lvl>
-    <w:lvl w:ilvl="6" w:tplc="BF54A466">
-      <w:numFmt w:val="decimal"/>
-      <w:lvlText w:val=""/>
-      <w:lvlJc w:val="left"/>
-    </w:lvl>
-    <w:lvl w:ilvl="7" w:tplc="79F8BE72">
-      <w:numFmt w:val="decimal"/>
-      <w:lvlText w:val=""/>
-      <w:lvlJc w:val="left"/>
-    </w:lvl>
-    <w:lvl w:ilvl="8" w:tplc="9FE6CFD4">
-      <w:numFmt w:val="decimal"/>
-      <w:lvlText w:val=""/>
-      <w:lvlJc w:val="left"/>
-    </w:lvl>
-  </w:abstractNum>
-  <w:num w:numId="1" w16cid:durableId="1095902201">
+  <w:num w:numId="1" w16cid:durableId="1345589798">
+    <w:abstractNumId w:val="3"/>
+    <w:lvlOverride w:ilvl="0">
+      <w:startOverride w:val="1"/>
+    </w:lvlOverride>
+  </w:num>
+  <w:num w:numId="2" w16cid:durableId="1508254031">
+    <w:abstractNumId w:val="1"/>
+    <w:lvlOverride w:ilvl="0">
+      <w:startOverride w:val="1"/>
+    </w:lvlOverride>
+  </w:num>
+  <w:num w:numId="3" w16cid:durableId="2062290609">
     <w:abstractNumId w:val="0"/>
     <w:lvlOverride w:ilvl="0">
       <w:startOverride w:val="1"/>
     </w:lvlOverride>
   </w:num>
-  <w:num w:numId="2" w16cid:durableId="2044596165">
-    <w:abstractNumId w:val="1"/>
-    <w:lvlOverride w:ilvl="0">
-      <w:startOverride w:val="1"/>
-    </w:lvlOverride>
-  </w:num>
-  <w:num w:numId="3" w16cid:durableId="881940194">
+  <w:num w:numId="4" w16cid:durableId="984432195">
     <w:abstractNumId w:val="2"/>
-    <w:lvlOverride w:ilvl="0">
-      <w:startOverride w:val="1"/>
-    </w:lvlOverride>
-  </w:num>
-  <w:num w:numId="4" w16cid:durableId="499927053">
-    <w:abstractNumId w:val="3"/>
     <w:lvlOverride w:ilvl="0">
       <w:startOverride w:val="1"/>
     </w:lvlOverride>
@@ -6686,7 +6689,7 @@
     <w:autoRedefine/>
     <w:uiPriority w:val="39"/>
     <w:unhideWhenUsed/>
-    <w:rsid w:val="00D92EC4"/>
+    <w:rsid w:val="008338B6"/>
     <w:pPr>
       <w:spacing w:after="100"/>
     </w:pPr>
@@ -6698,7 +6701,7 @@
     <w:autoRedefine/>
     <w:uiPriority w:val="39"/>
     <w:unhideWhenUsed/>
-    <w:rsid w:val="00D92EC4"/>
+    <w:rsid w:val="008338B6"/>
     <w:pPr>
       <w:spacing w:after="100"/>
       <w:ind w:left="210"/>

</xml_diff>

<commit_message>
Move both controls to the Montariva Technology publisher
Publisher AnkitRanaTech (prefix art) becomes MontarivaTechnology (prefix mrt),
with one shared option value prefix. Control namespace, solution unique names
(MrtFileDropZone, MrtSignaturePad), release asset names, display names, READMEs,
user guides and walkthrough pages follow.

A new publisher can't upgrade the old Art* solutions, so this ships as
File Drop Zone 0.3.0 and Signature Pad 0.2.0.
</commit_message>
<xml_diff>
--- a/FileDropZone/docs/FileDropZone-User-Guide.docx
+++ b/FileDropZone/docs/FileDropZone-User-Guide.docx
@@ -15,7 +15,7 @@
           <w:sz w:val="20"/>
           <w:szCs w:val="20"/>
         </w:rPr>
-        <w:t>AnkitRana-Tech  ·  PCF CONTROL</w:t>
+        <w:t>Montariva Technology  ·  PCF CONTROL</w:t>
       </w:r>
     </w:p>
     <w:p>
@@ -70,7 +70,7 @@
           <w:noProof/>
         </w:rPr>
         <w:drawing>
-          <wp:inline distT="0" distB="0" distL="0" distR="0" wp14:anchorId="3E1123AF" wp14:editId="3292BF1A">
+          <wp:inline distT="0" distB="0" distL="0" distR="0" wp14:anchorId="148BD080" wp14:editId="52CA8ADA">
             <wp:extent cx="5715000" cy="2009775"/>
             <wp:effectExtent l="0" t="0" r="0" b="0"/>
             <wp:docPr id="1" name="control-saved.png" descr="control-saved.png" title="control-saved.png"/>
@@ -166,7 +166,7 @@
     <w:sdt>
       <w:sdtPr>
         <w:alias w:val="Contents"/>
-        <w:id w:val="-1778257155"/>
+        <w:id w:val="1654172527"/>
       </w:sdtPr>
       <w:sdtEndPr/>
       <w:sdtContent>
@@ -195,7 +195,7 @@
           <w:r>
             <w:fldChar w:fldCharType="separate"/>
           </w:r>
-          <w:hyperlink w:anchor="_Toc242180888" w:history="1">
+          <w:hyperlink w:anchor="_Toc242627221" w:history="1">
             <w:r>
               <w:rPr>
                 <w:rStyle w:val="Hyperlink"/>
@@ -219,7 +219,7 @@
               <w:rPr>
                 <w:noProof/>
               </w:rPr>
-              <w:instrText xml:space="preserve"> PAGEREF _Toc242180888 \h </w:instrText>
+              <w:instrText xml:space="preserve"> PAGEREF _Toc242627221 \h </w:instrText>
             </w:r>
             <w:r>
               <w:rPr>
@@ -262,7 +262,7 @@
               <w14:ligatures w14:val="standardContextual"/>
             </w:rPr>
           </w:pPr>
-          <w:hyperlink w:anchor="_Toc242180889" w:history="1">
+          <w:hyperlink w:anchor="_Toc242627222" w:history="1">
             <w:r>
               <w:rPr>
                 <w:rStyle w:val="Hyperlink"/>
@@ -286,7 +286,7 @@
               <w:rPr>
                 <w:noProof/>
               </w:rPr>
-              <w:instrText xml:space="preserve"> PAGEREF _Toc242180889 \h </w:instrText>
+              <w:instrText xml:space="preserve"> PAGEREF _Toc242627222 \h </w:instrText>
             </w:r>
             <w:r>
               <w:rPr>
@@ -329,7 +329,7 @@
               <w14:ligatures w14:val="standardContextual"/>
             </w:rPr>
           </w:pPr>
-          <w:hyperlink w:anchor="_Toc242180890" w:history="1">
+          <w:hyperlink w:anchor="_Toc242627223" w:history="1">
             <w:r>
               <w:rPr>
                 <w:rStyle w:val="Hyperlink"/>
@@ -353,7 +353,7 @@
               <w:rPr>
                 <w:noProof/>
               </w:rPr>
-              <w:instrText xml:space="preserve"> PAGEREF _Toc242180890 \h </w:instrText>
+              <w:instrText xml:space="preserve"> PAGEREF _Toc242627223 \h </w:instrText>
             </w:r>
             <w:r>
               <w:rPr>
@@ -396,7 +396,7 @@
               <w14:ligatures w14:val="standardContextual"/>
             </w:rPr>
           </w:pPr>
-          <w:hyperlink w:anchor="_Toc242180891" w:history="1">
+          <w:hyperlink w:anchor="_Toc242627224" w:history="1">
             <w:r>
               <w:rPr>
                 <w:rStyle w:val="Hyperlink"/>
@@ -420,7 +420,7 @@
               <w:rPr>
                 <w:noProof/>
               </w:rPr>
-              <w:instrText xml:space="preserve"> PAGEREF _Toc242180891 \h </w:instrText>
+              <w:instrText xml:space="preserve"> PAGEREF _Toc242627224 \h </w:instrText>
             </w:r>
             <w:r>
               <w:rPr>
@@ -463,7 +463,7 @@
               <w14:ligatures w14:val="standardContextual"/>
             </w:rPr>
           </w:pPr>
-          <w:hyperlink w:anchor="_Toc242180892" w:history="1">
+          <w:hyperlink w:anchor="_Toc242627225" w:history="1">
             <w:r>
               <w:rPr>
                 <w:rStyle w:val="Hyperlink"/>
@@ -487,7 +487,7 @@
               <w:rPr>
                 <w:noProof/>
               </w:rPr>
-              <w:instrText xml:space="preserve"> PAGEREF _Toc242180892 \h </w:instrText>
+              <w:instrText xml:space="preserve"> PAGEREF _Toc242627225 \h </w:instrText>
             </w:r>
             <w:r>
               <w:rPr>
@@ -530,7 +530,7 @@
               <w14:ligatures w14:val="standardContextual"/>
             </w:rPr>
           </w:pPr>
-          <w:hyperlink w:anchor="_Toc242180893" w:history="1">
+          <w:hyperlink w:anchor="_Toc242627226" w:history="1">
             <w:r>
               <w:rPr>
                 <w:rStyle w:val="Hyperlink"/>
@@ -554,7 +554,7 @@
               <w:rPr>
                 <w:noProof/>
               </w:rPr>
-              <w:instrText xml:space="preserve"> PAGEREF _Toc242180893 \h </w:instrText>
+              <w:instrText xml:space="preserve"> PAGEREF _Toc242627226 \h </w:instrText>
             </w:r>
             <w:r>
               <w:rPr>
@@ -597,7 +597,7 @@
               <w14:ligatures w14:val="standardContextual"/>
             </w:rPr>
           </w:pPr>
-          <w:hyperlink w:anchor="_Toc242180894" w:history="1">
+          <w:hyperlink w:anchor="_Toc242627227" w:history="1">
             <w:r>
               <w:rPr>
                 <w:rStyle w:val="Hyperlink"/>
@@ -621,7 +621,7 @@
               <w:rPr>
                 <w:noProof/>
               </w:rPr>
-              <w:instrText xml:space="preserve"> PAGEREF _Toc242180894 \h </w:instrText>
+              <w:instrText xml:space="preserve"> PAGEREF _Toc242627227 \h </w:instrText>
             </w:r>
             <w:r>
               <w:rPr>
@@ -664,7 +664,7 @@
               <w14:ligatures w14:val="standardContextual"/>
             </w:rPr>
           </w:pPr>
-          <w:hyperlink w:anchor="_Toc242180895" w:history="1">
+          <w:hyperlink w:anchor="_Toc242627228" w:history="1">
             <w:r>
               <w:rPr>
                 <w:rStyle w:val="Hyperlink"/>
@@ -688,7 +688,7 @@
               <w:rPr>
                 <w:noProof/>
               </w:rPr>
-              <w:instrText xml:space="preserve"> PAGEREF _Toc242180895 \h </w:instrText>
+              <w:instrText xml:space="preserve"> PAGEREF _Toc242627228 \h </w:instrText>
             </w:r>
             <w:r>
               <w:rPr>
@@ -731,7 +731,7 @@
               <w14:ligatures w14:val="standardContextual"/>
             </w:rPr>
           </w:pPr>
-          <w:hyperlink w:anchor="_Toc242180896" w:history="1">
+          <w:hyperlink w:anchor="_Toc242627229" w:history="1">
             <w:r>
               <w:rPr>
                 <w:rStyle w:val="Hyperlink"/>
@@ -755,7 +755,7 @@
               <w:rPr>
                 <w:noProof/>
               </w:rPr>
-              <w:instrText xml:space="preserve"> PAGEREF _Toc242180896 \h </w:instrText>
+              <w:instrText xml:space="preserve"> PAGEREF _Toc242627229 \h </w:instrText>
             </w:r>
             <w:r>
               <w:rPr>
@@ -798,7 +798,7 @@
               <w14:ligatures w14:val="standardContextual"/>
             </w:rPr>
           </w:pPr>
-          <w:hyperlink w:anchor="_Toc242180897" w:history="1">
+          <w:hyperlink w:anchor="_Toc242627230" w:history="1">
             <w:r>
               <w:rPr>
                 <w:rStyle w:val="Hyperlink"/>
@@ -822,7 +822,7 @@
               <w:rPr>
                 <w:noProof/>
               </w:rPr>
-              <w:instrText xml:space="preserve"> PAGEREF _Toc242180897 \h </w:instrText>
+              <w:instrText xml:space="preserve"> PAGEREF _Toc242627230 \h </w:instrText>
             </w:r>
             <w:r>
               <w:rPr>
@@ -865,7 +865,7 @@
               <w14:ligatures w14:val="standardContextual"/>
             </w:rPr>
           </w:pPr>
-          <w:hyperlink w:anchor="_Toc242180898" w:history="1">
+          <w:hyperlink w:anchor="_Toc242627231" w:history="1">
             <w:r>
               <w:rPr>
                 <w:rStyle w:val="Hyperlink"/>
@@ -889,7 +889,7 @@
               <w:rPr>
                 <w:noProof/>
               </w:rPr>
-              <w:instrText xml:space="preserve"> PAGEREF _Toc242180898 \h </w:instrText>
+              <w:instrText xml:space="preserve"> PAGEREF _Toc242627231 \h </w:instrText>
             </w:r>
             <w:r>
               <w:rPr>
@@ -932,7 +932,7 @@
               <w14:ligatures w14:val="standardContextual"/>
             </w:rPr>
           </w:pPr>
-          <w:hyperlink w:anchor="_Toc242180899" w:history="1">
+          <w:hyperlink w:anchor="_Toc242627232" w:history="1">
             <w:r>
               <w:rPr>
                 <w:rStyle w:val="Hyperlink"/>
@@ -956,7 +956,7 @@
               <w:rPr>
                 <w:noProof/>
               </w:rPr>
-              <w:instrText xml:space="preserve"> PAGEREF _Toc242180899 \h </w:instrText>
+              <w:instrText xml:space="preserve"> PAGEREF _Toc242627232 \h </w:instrText>
             </w:r>
             <w:r>
               <w:rPr>
@@ -995,7 +995,7 @@
         <w:pStyle w:val="Heading1"/>
         <w:pageBreakBefore/>
       </w:pPr>
-      <w:bookmarkStart w:id="0" w:name="_Toc242180888"/>
+      <w:bookmarkStart w:id="0" w:name="_Toc242627221"/>
       <w:r>
         <w:t>1. Overview</w:t>
       </w:r>
@@ -1059,7 +1059,7 @@
           <w:noProof/>
         </w:rPr>
         <w:drawing>
-          <wp:inline distT="0" distB="0" distL="0" distR="0" wp14:anchorId="42BA09B5" wp14:editId="7613469B">
+          <wp:inline distT="0" distB="0" distL="0" distR="0" wp14:anchorId="3F3DAA8E" wp14:editId="3BC4EFDD">
             <wp:extent cx="5334000" cy="3028950"/>
             <wp:effectExtent l="0" t="0" r="0" b="0"/>
             <wp:docPr id="2" name="control-uploading.png" descr="Upload queue: a blocked file, a duplicate prompt, a large file at 57% and a finished upload" title="Upload queue: a blocked file, a duplicate prompt, a large file at 57% and a finished upload"/>
@@ -1118,7 +1118,7 @@
       <w:pPr>
         <w:pStyle w:val="Heading2"/>
       </w:pPr>
-      <w:bookmarkStart w:id="1" w:name="_Toc242180889"/>
+      <w:bookmarkStart w:id="1" w:name="_Toc242627222"/>
       <w:r>
         <w:t>Features</w:t>
       </w:r>
@@ -1918,7 +1918,7 @@
       <w:pPr>
         <w:pStyle w:val="Heading1"/>
       </w:pPr>
-      <w:bookmarkStart w:id="2" w:name="_Toc242180890"/>
+      <w:bookmarkStart w:id="2" w:name="_Toc242627223"/>
       <w:r>
         <w:t>2. Requirements</w:t>
       </w:r>
@@ -2020,7 +2020,7 @@
       <w:pPr>
         <w:pStyle w:val="Heading1"/>
       </w:pPr>
-      <w:bookmarkStart w:id="3" w:name="_Toc242180891"/>
+      <w:bookmarkStart w:id="3" w:name="_Toc242627224"/>
       <w:r>
         <w:t>3. Install the solution</w:t>
       </w:r>
@@ -2045,7 +2045,7 @@
           <w:sz w:val="19"/>
           <w:szCs w:val="19"/>
         </w:rPr>
-        <w:t>ArtFileDropZone_managed.zip</w:t>
+        <w:t>MrtFileDropZone_managed.zip</w:t>
       </w:r>
       <w:r>
         <w:t xml:space="preserve"> from the latest </w:t>
@@ -2186,7 +2186,7 @@
         <w:pStyle w:val="Heading1"/>
         <w:pageBreakBefore/>
       </w:pPr>
-      <w:bookmarkStart w:id="4" w:name="_Toc242180892"/>
+      <w:bookmarkStart w:id="4" w:name="_Toc242627225"/>
       <w:r>
         <w:t>4. Add the control to a form</w:t>
       </w:r>
@@ -2308,7 +2308,7 @@
           <w:b/>
           <w:bCs/>
         </w:rPr>
-        <w:t>File Drop Zone (AnkitRana-Tech)</w:t>
+        <w:t>File Drop Zone (Montariva Technology)</w:t>
       </w:r>
       <w:r>
         <w:t>.</w:t>
@@ -2448,7 +2448,7 @@
         <w:t>Add Control...</w:t>
       </w:r>
       <w:r>
-        <w:t xml:space="preserve"> &gt; File Drop Zone (AnkitRana-Tech) &gt; set the options &gt; select the Web / Phone / Tablet options &gt; </w:t>
+        <w:t xml:space="preserve"> &gt; File Drop Zone (Montariva Technology) &gt; set the options &gt; select the Web / Phone / Tablet options &gt; </w:t>
       </w:r>
       <w:r>
         <w:rPr>
@@ -2465,7 +2465,7 @@
       <w:pPr>
         <w:pStyle w:val="Heading1"/>
       </w:pPr>
-      <w:bookmarkStart w:id="5" w:name="_Toc242180893"/>
+      <w:bookmarkStart w:id="5" w:name="_Toc242627226"/>
       <w:r>
         <w:t>5. Settings reference</w:t>
       </w:r>
@@ -3260,7 +3260,7 @@
       <w:pPr>
         <w:pStyle w:val="Heading2"/>
       </w:pPr>
-      <w:bookmarkStart w:id="6" w:name="_Toc242180894"/>
+      <w:bookmarkStart w:id="6" w:name="_Toc242627227"/>
       <w:r>
         <w:t>Example setups</w:t>
       </w:r>
@@ -3529,7 +3529,7 @@
       <w:pPr>
         <w:pStyle w:val="Heading1"/>
       </w:pPr>
-      <w:bookmarkStart w:id="7" w:name="_Toc242180895"/>
+      <w:bookmarkStart w:id="7" w:name="_Toc242627228"/>
       <w:r>
         <w:t>6. Using the control</w:t>
       </w:r>
@@ -4055,7 +4055,7 @@
           <w:noProof/>
         </w:rPr>
         <w:drawing>
-          <wp:inline distT="0" distB="0" distL="0" distR="0" wp14:anchorId="5C88B10D" wp14:editId="02FD2C99">
+          <wp:inline distT="0" distB="0" distL="0" distR="0" wp14:anchorId="0D32C8CE" wp14:editId="704E404E">
             <wp:extent cx="3619500" cy="2857500"/>
             <wp:effectExtent l="0" t="0" r="0" b="0"/>
             <wp:docPr id="3" name="control-preview.png" descr="Preview dialog for an image attachment" title="Preview dialog for an image attachment"/>
@@ -4115,7 +4115,7 @@
         <w:pStyle w:val="Heading1"/>
         <w:pageBreakBefore/>
       </w:pPr>
-      <w:bookmarkStart w:id="8" w:name="_Toc242180896"/>
+      <w:bookmarkStart w:id="8" w:name="_Toc242627229"/>
       <w:r>
         <w:t>7. File rules and limits</w:t>
       </w:r>
@@ -4563,7 +4563,7 @@
       <w:pPr>
         <w:pStyle w:val="Heading1"/>
       </w:pPr>
-      <w:bookmarkStart w:id="9" w:name="_Toc242180897"/>
+      <w:bookmarkStart w:id="9" w:name="_Toc242627230"/>
       <w:r>
         <w:t>8. Security</w:t>
       </w:r>
@@ -4895,7 +4895,7 @@
         <w:pStyle w:val="Heading1"/>
         <w:pageBreakBefore/>
       </w:pPr>
-      <w:bookmarkStart w:id="10" w:name="_Toc242180898"/>
+      <w:bookmarkStart w:id="10" w:name="_Toc242627231"/>
       <w:r>
         <w:t>9. Troubleshooting</w:t>
       </w:r>
@@ -5494,7 +5494,7 @@
       <w:pPr>
         <w:pStyle w:val="Heading1"/>
       </w:pPr>
-      <w:bookmarkStart w:id="11" w:name="_Toc242180899"/>
+      <w:bookmarkStart w:id="11" w:name="_Toc242627232"/>
       <w:r>
         <w:t>10. Update or uninstall</w:t>
       </w:r>
@@ -5611,7 +5611,7 @@
         <w:sz w:val="16"/>
         <w:szCs w:val="16"/>
       </w:rPr>
-      <w:t>AnkitRana-Tech  ·  github.com/ankitrana</w:t>
+      <w:t>Montariva Technology  ·  github.com/ankitrana</w:t>
     </w:r>
     <w:r>
       <w:rPr>
@@ -5782,10 +5782,10 @@
 <file path=word/numbering.xml><?xml version="1.0" encoding="utf-8"?>
 <w:numbering xmlns:wpc="http://schemas.microsoft.com/office/word/2010/wordprocessingCanvas" xmlns:cx="http://schemas.microsoft.com/office/drawing/2014/chartex" xmlns:cx1="http://schemas.microsoft.com/office/drawing/2015/9/8/chartex" xmlns:cx2="http://schemas.microsoft.com/office/drawing/2015/10/21/chartex" xmlns:cx3="http://schemas.microsoft.com/office/drawing/2016/5/9/chartex" xmlns:cx4="http://schemas.microsoft.com/office/drawing/2016/5/10/chartex" xmlns:cx5="http://schemas.microsoft.com/office/drawing/2016/5/11/chartex" xmlns:cx6="http://schemas.microsoft.com/office/drawing/2016/5/12/chartex" xmlns:cx7="http://schemas.microsoft.com/office/drawing/2016/5/13/chartex" xmlns:cx8="http://schemas.microsoft.com/office/drawing/2016/5/14/chartex" xmlns:mc="http://schemas.openxmlformats.org/markup-compatibility/2006" xmlns:aink="http://schemas.microsoft.com/office/drawing/2016/ink" xmlns:am3d="http://schemas.microsoft.com/office/drawing/2017/model3d" xmlns:o="urn:schemas-microsoft-com:office:office" xmlns:oel="http://schemas.microsoft.com/office/2019/extlst" xmlns:r="http://schemas.openxmlformats.org/officeDocument/2006/relationships" xmlns:m="http://schemas.openxmlformats.org/officeDocument/2006/math" xmlns:v="urn:schemas-microsoft-com:vml" xmlns:wp14="http://schemas.microsoft.com/office/word/2010/wordprocessingDrawing" xmlns:wp="http://schemas.openxmlformats.org/drawingml/2006/wordprocessingDrawing" xmlns:w10="urn:schemas-microsoft-com:office:word" xmlns:w="http://schemas.openxmlformats.org/wordprocessingml/2006/main" xmlns:w14="http://schemas.microsoft.com/office/word/2010/wordml" xmlns:w15="http://schemas.microsoft.com/office/word/2012/wordml" xmlns:w16cex="http://schemas.microsoft.com/office/word/2018/wordml/cex" xmlns:w16cid="http://schemas.microsoft.com/office/word/2016/wordml/cid" xmlns:w16="http://schemas.microsoft.com/office/word/2018/wordml" xmlns:w16du="http://schemas.microsoft.com/office/word/2023/wordml/word16du" xmlns:w16sdtdh="http://schemas.microsoft.com/office/word/2020/wordml/sdtdatahash" xmlns:w16sdtfl="http://schemas.microsoft.com/office/word/2024/wordml/sdtformatlock" xmlns:w16se="http://schemas.microsoft.com/office/word/2015/wordml/symex" xmlns:wpg="http://schemas.microsoft.com/office/word/2010/wordprocessingGroup" xmlns:wpi="http://schemas.microsoft.com/office/word/2010/wordprocessingInk" xmlns:wne="http://schemas.microsoft.com/office/word/2006/wordml" xmlns:wps="http://schemas.microsoft.com/office/word/2010/wordprocessingShape" mc:Ignorable="w14 w15 w16se w16cid w16 w16cex w16sdtdh w16sdtfl w16du wp14">
   <w:abstractNum w:abstractNumId="0" w15:restartNumberingAfterBreak="0">
-    <w:nsid w:val="465B5897"/>
+    <w:nsid w:val="03CB3468"/>
     <w:multiLevelType w:val="hybridMultilevel"/>
-    <w:tmpl w:val="AA282D3C"/>
-    <w:lvl w:ilvl="0" w:tplc="A84E4F7C">
+    <w:tmpl w:val="5594967E"/>
+    <w:lvl w:ilvl="0" w:tplc="E8DE4C96">
       <w:start w:val="1"/>
       <w:numFmt w:val="decimal"/>
       <w:lvlText w:val="%1."/>
@@ -5794,52 +5794,52 @@
         <w:ind w:left="400" w:hanging="300"/>
       </w:pPr>
     </w:lvl>
-    <w:lvl w:ilvl="1" w:tplc="A5820EC6">
+    <w:lvl w:ilvl="1" w:tplc="A3F69076">
       <w:numFmt w:val="decimal"/>
       <w:lvlText w:val=""/>
       <w:lvlJc w:val="left"/>
     </w:lvl>
-    <w:lvl w:ilvl="2" w:tplc="09FA1200">
+    <w:lvl w:ilvl="2" w:tplc="6D2CC964">
       <w:numFmt w:val="decimal"/>
       <w:lvlText w:val=""/>
       <w:lvlJc w:val="left"/>
     </w:lvl>
-    <w:lvl w:ilvl="3" w:tplc="F258A04C">
+    <w:lvl w:ilvl="3" w:tplc="77F441F8">
       <w:numFmt w:val="decimal"/>
       <w:lvlText w:val=""/>
       <w:lvlJc w:val="left"/>
     </w:lvl>
-    <w:lvl w:ilvl="4" w:tplc="0AD0407C">
+    <w:lvl w:ilvl="4" w:tplc="57280D84">
       <w:numFmt w:val="decimal"/>
       <w:lvlText w:val=""/>
       <w:lvlJc w:val="left"/>
     </w:lvl>
-    <w:lvl w:ilvl="5" w:tplc="2CB2FA5A">
+    <w:lvl w:ilvl="5" w:tplc="C1625AAA">
       <w:numFmt w:val="decimal"/>
       <w:lvlText w:val=""/>
       <w:lvlJc w:val="left"/>
     </w:lvl>
-    <w:lvl w:ilvl="6" w:tplc="D6C0259E">
+    <w:lvl w:ilvl="6" w:tplc="7E1C8446">
       <w:numFmt w:val="decimal"/>
       <w:lvlText w:val=""/>
       <w:lvlJc w:val="left"/>
     </w:lvl>
-    <w:lvl w:ilvl="7" w:tplc="8DE2825A">
+    <w:lvl w:ilvl="7" w:tplc="DF7658FC">
       <w:numFmt w:val="decimal"/>
       <w:lvlText w:val=""/>
       <w:lvlJc w:val="left"/>
     </w:lvl>
-    <w:lvl w:ilvl="8" w:tplc="4B485F30">
+    <w:lvl w:ilvl="8" w:tplc="250CB36E">
       <w:numFmt w:val="decimal"/>
       <w:lvlText w:val=""/>
       <w:lvlJc w:val="left"/>
     </w:lvl>
   </w:abstractNum>
   <w:abstractNum w:abstractNumId="1" w15:restartNumberingAfterBreak="0">
-    <w:nsid w:val="59666D57"/>
+    <w:nsid w:val="1FD03702"/>
     <w:multiLevelType w:val="hybridMultilevel"/>
-    <w:tmpl w:val="F33843BA"/>
-    <w:lvl w:ilvl="0" w:tplc="85B03600">
+    <w:tmpl w:val="2CC4A470"/>
+    <w:lvl w:ilvl="0" w:tplc="00BEE30C">
       <w:start w:val="1"/>
       <w:numFmt w:val="bullet"/>
       <w:lvlText w:val="•"/>
@@ -5848,52 +5848,52 @@
         <w:ind w:left="400" w:hanging="260"/>
       </w:pPr>
     </w:lvl>
-    <w:lvl w:ilvl="1" w:tplc="09C41F0A">
+    <w:lvl w:ilvl="1" w:tplc="BF6647C6">
       <w:numFmt w:val="decimal"/>
       <w:lvlText w:val=""/>
       <w:lvlJc w:val="left"/>
     </w:lvl>
-    <w:lvl w:ilvl="2" w:tplc="1BA01D9E">
+    <w:lvl w:ilvl="2" w:tplc="051A1B62">
       <w:numFmt w:val="decimal"/>
       <w:lvlText w:val=""/>
       <w:lvlJc w:val="left"/>
     </w:lvl>
-    <w:lvl w:ilvl="3" w:tplc="9D24F290">
+    <w:lvl w:ilvl="3" w:tplc="046A9E14">
       <w:numFmt w:val="decimal"/>
       <w:lvlText w:val=""/>
       <w:lvlJc w:val="left"/>
     </w:lvl>
-    <w:lvl w:ilvl="4" w:tplc="2B8854FA">
+    <w:lvl w:ilvl="4" w:tplc="03481CFE">
       <w:numFmt w:val="decimal"/>
       <w:lvlText w:val=""/>
       <w:lvlJc w:val="left"/>
     </w:lvl>
-    <w:lvl w:ilvl="5" w:tplc="8B38757C">
+    <w:lvl w:ilvl="5" w:tplc="8DFEAE3E">
       <w:numFmt w:val="decimal"/>
       <w:lvlText w:val=""/>
       <w:lvlJc w:val="left"/>
     </w:lvl>
-    <w:lvl w:ilvl="6" w:tplc="A190B9C2">
+    <w:lvl w:ilvl="6" w:tplc="1D0A6EBC">
       <w:numFmt w:val="decimal"/>
       <w:lvlText w:val=""/>
       <w:lvlJc w:val="left"/>
     </w:lvl>
-    <w:lvl w:ilvl="7" w:tplc="D2A23C7A">
+    <w:lvl w:ilvl="7" w:tplc="987C5BD4">
       <w:numFmt w:val="decimal"/>
       <w:lvlText w:val=""/>
       <w:lvlJc w:val="left"/>
     </w:lvl>
-    <w:lvl w:ilvl="8" w:tplc="A52E3F7E">
+    <w:lvl w:ilvl="8" w:tplc="29109F20">
       <w:numFmt w:val="decimal"/>
       <w:lvlText w:val=""/>
       <w:lvlJc w:val="left"/>
     </w:lvl>
   </w:abstractNum>
   <w:abstractNum w:abstractNumId="2" w15:restartNumberingAfterBreak="0">
-    <w:nsid w:val="59B95777"/>
+    <w:nsid w:val="24311CEB"/>
     <w:multiLevelType w:val="hybridMultilevel"/>
-    <w:tmpl w:val="79482C60"/>
-    <w:lvl w:ilvl="0" w:tplc="DD8E1032">
+    <w:tmpl w:val="2EF27052"/>
+    <w:lvl w:ilvl="0" w:tplc="54F8FFE8">
       <w:start w:val="1"/>
       <w:numFmt w:val="decimal"/>
       <w:lvlText w:val="%1."/>
@@ -5902,52 +5902,52 @@
         <w:ind w:left="400" w:hanging="300"/>
       </w:pPr>
     </w:lvl>
-    <w:lvl w:ilvl="1" w:tplc="A7C26A7C">
+    <w:lvl w:ilvl="1" w:tplc="006694A2">
       <w:numFmt w:val="decimal"/>
       <w:lvlText w:val=""/>
       <w:lvlJc w:val="left"/>
     </w:lvl>
-    <w:lvl w:ilvl="2" w:tplc="AC5E10E8">
+    <w:lvl w:ilvl="2" w:tplc="B34E2938">
       <w:numFmt w:val="decimal"/>
       <w:lvlText w:val=""/>
       <w:lvlJc w:val="left"/>
     </w:lvl>
-    <w:lvl w:ilvl="3" w:tplc="079070A8">
+    <w:lvl w:ilvl="3" w:tplc="D06EC662">
       <w:numFmt w:val="decimal"/>
       <w:lvlText w:val=""/>
       <w:lvlJc w:val="left"/>
     </w:lvl>
-    <w:lvl w:ilvl="4" w:tplc="4B30C79C">
+    <w:lvl w:ilvl="4" w:tplc="146E40CA">
       <w:numFmt w:val="decimal"/>
       <w:lvlText w:val=""/>
       <w:lvlJc w:val="left"/>
     </w:lvl>
-    <w:lvl w:ilvl="5" w:tplc="5CB4EEAA">
+    <w:lvl w:ilvl="5" w:tplc="F014B4BA">
       <w:numFmt w:val="decimal"/>
       <w:lvlText w:val=""/>
       <w:lvlJc w:val="left"/>
     </w:lvl>
-    <w:lvl w:ilvl="6" w:tplc="A8B22BDA">
+    <w:lvl w:ilvl="6" w:tplc="B734CDF6">
       <w:numFmt w:val="decimal"/>
       <w:lvlText w:val=""/>
       <w:lvlJc w:val="left"/>
     </w:lvl>
-    <w:lvl w:ilvl="7" w:tplc="D8EEAD18">
+    <w:lvl w:ilvl="7" w:tplc="CC1E5096">
       <w:numFmt w:val="decimal"/>
       <w:lvlText w:val=""/>
       <w:lvlJc w:val="left"/>
     </w:lvl>
-    <w:lvl w:ilvl="8" w:tplc="27E28912">
+    <w:lvl w:ilvl="8" w:tplc="FEA47834">
       <w:numFmt w:val="decimal"/>
       <w:lvlText w:val=""/>
       <w:lvlJc w:val="left"/>
     </w:lvl>
   </w:abstractNum>
   <w:abstractNum w:abstractNumId="3" w15:restartNumberingAfterBreak="0">
-    <w:nsid w:val="61C3450C"/>
+    <w:nsid w:val="73FF5FF3"/>
     <w:multiLevelType w:val="hybridMultilevel"/>
-    <w:tmpl w:val="9F9E206A"/>
-    <w:lvl w:ilvl="0" w:tplc="CDDAA552" w:tentative="1">
+    <w:tmpl w:val="45A688E4"/>
+    <w:lvl w:ilvl="0" w:tplc="1CD0C7AE" w:tentative="1">
       <w:start w:val="1"/>
       <w:numFmt w:val="bullet"/>
       <w:lvlText w:val="●"/>
@@ -5956,7 +5956,7 @@
         <w:ind w:left="720" w:hanging="360"/>
       </w:pPr>
     </w:lvl>
-    <w:lvl w:ilvl="1" w:tplc="E93E6C64" w:tentative="1">
+    <w:lvl w:ilvl="1" w:tplc="DAF6BB04" w:tentative="1">
       <w:start w:val="1"/>
       <w:numFmt w:val="bullet"/>
       <w:lvlText w:val="○"/>
@@ -5965,7 +5965,7 @@
         <w:ind w:left="1440" w:hanging="360"/>
       </w:pPr>
     </w:lvl>
-    <w:lvl w:ilvl="2" w:tplc="90081C18" w:tentative="1">
+    <w:lvl w:ilvl="2" w:tplc="1826DB22" w:tentative="1">
       <w:start w:val="1"/>
       <w:numFmt w:val="bullet"/>
       <w:lvlText w:val="■"/>
@@ -5974,7 +5974,7 @@
         <w:ind w:left="2160" w:hanging="360"/>
       </w:pPr>
     </w:lvl>
-    <w:lvl w:ilvl="3" w:tplc="3E2C9AFA" w:tentative="1">
+    <w:lvl w:ilvl="3" w:tplc="559A65B2" w:tentative="1">
       <w:start w:val="1"/>
       <w:numFmt w:val="bullet"/>
       <w:lvlText w:val="●"/>
@@ -5983,7 +5983,7 @@
         <w:ind w:left="2880" w:hanging="360"/>
       </w:pPr>
     </w:lvl>
-    <w:lvl w:ilvl="4" w:tplc="E8C0C214" w:tentative="1">
+    <w:lvl w:ilvl="4" w:tplc="DD8CD2A8" w:tentative="1">
       <w:start w:val="1"/>
       <w:numFmt w:val="bullet"/>
       <w:lvlText w:val="○"/>
@@ -5992,7 +5992,7 @@
         <w:ind w:left="3600" w:hanging="360"/>
       </w:pPr>
     </w:lvl>
-    <w:lvl w:ilvl="5" w:tplc="2B748714" w:tentative="1">
+    <w:lvl w:ilvl="5" w:tplc="08A4CAFA" w:tentative="1">
       <w:start w:val="1"/>
       <w:numFmt w:val="bullet"/>
       <w:lvlText w:val="■"/>
@@ -6001,7 +6001,7 @@
         <w:ind w:left="4320" w:hanging="360"/>
       </w:pPr>
     </w:lvl>
-    <w:lvl w:ilvl="6" w:tplc="804A0E7A" w:tentative="1">
+    <w:lvl w:ilvl="6" w:tplc="589CF310" w:tentative="1">
       <w:start w:val="1"/>
       <w:numFmt w:val="bullet"/>
       <w:lvlText w:val="●"/>
@@ -6010,7 +6010,7 @@
         <w:ind w:left="5040" w:hanging="360"/>
       </w:pPr>
     </w:lvl>
-    <w:lvl w:ilvl="7" w:tplc="D178991C" w:tentative="1">
+    <w:lvl w:ilvl="7" w:tplc="311458DE" w:tentative="1">
       <w:start w:val="1"/>
       <w:numFmt w:val="bullet"/>
       <w:lvlText w:val="●"/>
@@ -6019,7 +6019,7 @@
         <w:ind w:left="5760" w:hanging="360"/>
       </w:pPr>
     </w:lvl>
-    <w:lvl w:ilvl="8" w:tplc="6B1A2C26" w:tentative="1">
+    <w:lvl w:ilvl="8" w:tplc="C5EA2680" w:tentative="1">
       <w:start w:val="1"/>
       <w:numFmt w:val="bullet"/>
       <w:lvlText w:val="●"/>
@@ -6029,25 +6029,25 @@
       </w:pPr>
     </w:lvl>
   </w:abstractNum>
-  <w:num w:numId="1" w16cid:durableId="1345589798">
+  <w:num w:numId="1" w16cid:durableId="1141656651">
     <w:abstractNumId w:val="3"/>
     <w:lvlOverride w:ilvl="0">
       <w:startOverride w:val="1"/>
     </w:lvlOverride>
   </w:num>
-  <w:num w:numId="2" w16cid:durableId="1508254031">
+  <w:num w:numId="2" w16cid:durableId="952516499">
     <w:abstractNumId w:val="1"/>
     <w:lvlOverride w:ilvl="0">
       <w:startOverride w:val="1"/>
     </w:lvlOverride>
   </w:num>
-  <w:num w:numId="3" w16cid:durableId="2062290609">
+  <w:num w:numId="3" w16cid:durableId="1286084494">
     <w:abstractNumId w:val="0"/>
     <w:lvlOverride w:ilvl="0">
       <w:startOverride w:val="1"/>
     </w:lvlOverride>
   </w:num>
-  <w:num w:numId="4" w16cid:durableId="984432195">
+  <w:num w:numId="4" w16cid:durableId="470901969">
     <w:abstractNumId w:val="2"/>
     <w:lvlOverride w:ilvl="0">
       <w:startOverride w:val="1"/>
@@ -6689,7 +6689,7 @@
     <w:autoRedefine/>
     <w:uiPriority w:val="39"/>
     <w:unhideWhenUsed/>
-    <w:rsid w:val="008338B6"/>
+    <w:rsid w:val="000A7881"/>
     <w:pPr>
       <w:spacing w:after="100"/>
     </w:pPr>
@@ -6701,7 +6701,7 @@
     <w:autoRedefine/>
     <w:uiPriority w:val="39"/>
     <w:unhideWhenUsed/>
-    <w:rsid w:val="008338B6"/>
+    <w:rsid w:val="000A7881"/>
     <w:pPr>
       <w:spacing w:after="100"/>
       <w:ind w:left="210"/>

</xml_diff>